<commit_message>
Update thesis documents: add 2026 improvement plan, modify outline, remove old template
Former-commit-id: bfd62dd1a4fbdb25521c0cdd182f4789022eae26
</commit_message>
<xml_diff>
--- a/论文思路大纲-反馈12-12.docx
+++ b/论文思路大纲-反馈12-12.docx
@@ -63,26 +63,14 @@
         <w:rPr>
           <w:rFonts w:hint="eastAsia"/>
         </w:rPr>
-        <w:t>月面</w:t>
-      </w:r>
-      <w:proofErr w:type="gramStart"/>
-      <w:r>
-        <w:rPr>
-          <w:rFonts w:hint="eastAsia"/>
-        </w:rPr>
-        <w:t>巡视器</w:t>
-      </w:r>
-      <w:proofErr w:type="gramEnd"/>
-      <w:r>
-        <w:rPr>
-          <w:rFonts w:hint="eastAsia"/>
-        </w:rPr>
-        <w:t>发展现状</w:t>
+        <w:t>月面巡视器发展现状</w:t>
       </w:r>
       <w:commentRangeEnd w:id="2"/>
       <w:r>
         <w:rPr>
           <w:rStyle w:val="af4"/>
+          <w:sz w:val="24"/>
+          <w:szCs w:val="24"/>
         </w:rPr>
         <w:commentReference w:id="2"/>
       </w:r>
@@ -104,21 +92,7 @@
         <w:rPr>
           <w:rFonts w:hint="eastAsia"/>
         </w:rPr>
-        <w:t>数字</w:t>
-      </w:r>
-      <w:proofErr w:type="gramStart"/>
-      <w:r>
-        <w:rPr>
-          <w:rFonts w:hint="eastAsia"/>
-        </w:rPr>
-        <w:t>孪生在巡视器</w:t>
-      </w:r>
-      <w:proofErr w:type="gramEnd"/>
-      <w:r>
-        <w:rPr>
-          <w:rFonts w:hint="eastAsia"/>
-        </w:rPr>
-        <w:t>自主行走中的研</w:t>
+        <w:t>数字孪生在巡视器自主行走中的研</w:t>
       </w:r>
       <w:commentRangeStart w:id="3"/>
       <w:r>
@@ -131,6 +105,8 @@
       <w:r>
         <w:rPr>
           <w:rStyle w:val="af4"/>
+          <w:sz w:val="24"/>
+          <w:szCs w:val="24"/>
         </w:rPr>
         <w:commentReference w:id="3"/>
       </w:r>
@@ -168,21 +144,7 @@
         <w:rPr>
           <w:rFonts w:hint="eastAsia"/>
         </w:rPr>
-        <w:t>月面</w:t>
-      </w:r>
-      <w:proofErr w:type="gramStart"/>
-      <w:r>
-        <w:rPr>
-          <w:rFonts w:hint="eastAsia"/>
-        </w:rPr>
-        <w:t>巡视器数字</w:t>
-      </w:r>
-      <w:proofErr w:type="gramEnd"/>
-      <w:r>
-        <w:rPr>
-          <w:rFonts w:hint="eastAsia"/>
-        </w:rPr>
-        <w:t>孪生</w:t>
+        <w:t>月面巡视器数字孪生</w:t>
       </w:r>
       <w:commentRangeStart w:id="5"/>
       <w:r>
@@ -196,8 +158,9 @@
       <w:r>
         <w:rPr>
           <w:rStyle w:val="af4"/>
-          <w:rFonts w:eastAsiaTheme="minorEastAsia" w:cstheme="minorBidi"/>
-          <w:color w:val="auto"/>
+          <w:rFonts w:hint="eastAsia"/>
+          <w:sz w:val="28"/>
+          <w:szCs w:val="28"/>
         </w:rPr>
         <w:commentReference w:id="5"/>
       </w:r>
@@ -234,21 +197,7 @@
         <w:rPr>
           <w:rFonts w:hint="eastAsia"/>
         </w:rPr>
-        <w:t>月面</w:t>
-      </w:r>
-      <w:proofErr w:type="gramStart"/>
-      <w:r>
-        <w:rPr>
-          <w:rFonts w:hint="eastAsia"/>
-        </w:rPr>
-        <w:t>巡视器数字</w:t>
-      </w:r>
-      <w:proofErr w:type="gramEnd"/>
-      <w:r>
-        <w:rPr>
-          <w:rFonts w:hint="eastAsia"/>
-        </w:rPr>
-        <w:t>孪生</w:t>
+        <w:t>月面巡视器数字孪生</w:t>
       </w:r>
       <w:r>
         <w:rPr>
@@ -281,6 +230,8 @@
       <w:r>
         <w:rPr>
           <w:rStyle w:val="af4"/>
+          <w:sz w:val="24"/>
+          <w:szCs w:val="24"/>
         </w:rPr>
         <w:commentReference w:id="7"/>
       </w:r>
@@ -288,6 +239,8 @@
       <w:r>
         <w:rPr>
           <w:rStyle w:val="af4"/>
+          <w:sz w:val="24"/>
+          <w:szCs w:val="24"/>
         </w:rPr>
         <w:commentReference w:id="6"/>
       </w:r>
@@ -299,21 +252,7 @@
         <w:rPr>
           <w:rFonts w:hint="eastAsia"/>
         </w:rPr>
-        <w:t>月面</w:t>
-      </w:r>
-      <w:proofErr w:type="gramStart"/>
-      <w:r>
-        <w:rPr>
-          <w:rFonts w:hint="eastAsia"/>
-        </w:rPr>
-        <w:t>巡视器数字</w:t>
-      </w:r>
-      <w:proofErr w:type="gramEnd"/>
-      <w:r>
-        <w:rPr>
-          <w:rFonts w:hint="eastAsia"/>
-        </w:rPr>
-        <w:t>孪生</w:t>
+        <w:t>月面巡视器数字孪生</w:t>
       </w:r>
       <w:r>
         <w:rPr>
@@ -339,6 +278,8 @@
       <w:r>
         <w:rPr>
           <w:rStyle w:val="af4"/>
+          <w:sz w:val="24"/>
+          <w:szCs w:val="24"/>
         </w:rPr>
         <w:commentReference w:id="8"/>
       </w:r>
@@ -362,21 +303,7 @@
         <w:rPr>
           <w:rFonts w:hint="eastAsia"/>
         </w:rPr>
-        <w:t>物理层：月面</w:t>
-      </w:r>
-      <w:proofErr w:type="gramStart"/>
-      <w:r>
-        <w:rPr>
-          <w:rFonts w:hint="eastAsia"/>
-        </w:rPr>
-        <w:t>巡视器</w:t>
-      </w:r>
-      <w:proofErr w:type="gramEnd"/>
-      <w:r>
-        <w:rPr>
-          <w:rFonts w:hint="eastAsia"/>
-        </w:rPr>
-        <w:t>实体</w:t>
+        <w:t>物理层：月面巡视器实体</w:t>
       </w:r>
       <w:r>
         <w:rPr>
@@ -384,21 +311,12 @@
         </w:rPr>
         <w:t>（</w:t>
       </w:r>
-      <w:proofErr w:type="gramStart"/>
       <w:r>
         <w:rPr>
           <w:rFonts w:hint="eastAsia"/>
           <w:color w:val="EE0000"/>
         </w:rPr>
-        <w:t>巡视器</w:t>
-      </w:r>
-      <w:proofErr w:type="gramEnd"/>
-      <w:r>
-        <w:rPr>
-          <w:rFonts w:hint="eastAsia"/>
-          <w:color w:val="EE0000"/>
-        </w:rPr>
-        <w:t>本体建模</w:t>
+        <w:t>巡视器本体建模</w:t>
       </w:r>
       <w:r>
         <w:rPr>
@@ -413,6 +331,9 @@
       <w:r>
         <w:rPr>
           <w:rStyle w:val="af4"/>
+          <w:rFonts w:hint="eastAsia"/>
+          <w:sz w:val="24"/>
+          <w:szCs w:val="24"/>
         </w:rPr>
         <w:commentReference w:id="9"/>
       </w:r>
@@ -429,7 +350,14 @@
         <w:rPr>
           <w:rFonts w:hint="eastAsia"/>
         </w:rPr>
-        <w:t>数据层：多源数据采集与融合</w:t>
+        <w:t>数据层：多源</w:t>
+      </w:r>
+      <w:bookmarkStart w:id="10" w:name="OLE_LINK1"/>
+      <w:r>
+        <w:rPr>
+          <w:rFonts w:hint="eastAsia"/>
+        </w:rPr>
+        <w:t>数据采集与融合</w:t>
       </w:r>
       <w:r>
         <w:br/>
@@ -447,7 +375,14 @@
         <w:rPr>
           <w:rFonts w:hint="eastAsia"/>
         </w:rPr>
-        <w:t>模型层：多尺度数字孪生模型</w:t>
+        <w:t>模型层：多尺度数</w:t>
+      </w:r>
+      <w:bookmarkEnd w:id="10"/>
+      <w:r>
+        <w:rPr>
+          <w:rFonts w:hint="eastAsia"/>
+        </w:rPr>
+        <w:t>字孪生模型</w:t>
       </w:r>
       <w:r>
         <w:br/>
@@ -467,22 +402,26 @@
         </w:rPr>
         <w:t>服务层：</w:t>
       </w:r>
-      <w:commentRangeStart w:id="10"/>
+      <w:commentRangeStart w:id="11"/>
       <w:r>
         <w:rPr>
           <w:rFonts w:hint="eastAsia"/>
         </w:rPr>
         <w:t>自主行走应用服务</w:t>
       </w:r>
-      <w:r>
-        <w:br/>
-      </w:r>
-      <w:commentRangeEnd w:id="10"/>
+      <w:bookmarkStart w:id="12" w:name="OLE_LINK2"/>
+      <w:r>
+        <w:br/>
+      </w:r>
+      <w:commentRangeEnd w:id="11"/>
       <w:r>
         <w:rPr>
           <w:rStyle w:val="af4"/>
-        </w:rPr>
-        <w:commentReference w:id="10"/>
+          <w:rFonts w:hint="eastAsia"/>
+          <w:sz w:val="24"/>
+          <w:szCs w:val="24"/>
+        </w:rPr>
+        <w:commentReference w:id="11"/>
       </w:r>
       <w:r>
         <w:rPr>
@@ -499,6 +438,7 @@
         </w:rPr>
         <w:t>交互层：可视化与交互界面</w:t>
       </w:r>
+      <w:bookmarkEnd w:id="12"/>
     </w:p>
     <w:p>
       <w:pPr>
@@ -507,7 +447,7 @@
       <w:r>
         <w:br/>
       </w:r>
-      <w:commentRangeStart w:id="11"/>
+      <w:commentRangeStart w:id="13"/>
       <w:r>
         <w:rPr>
           <w:strike/>
@@ -530,12 +470,16 @@
         </w:rPr>
         <w:br/>
       </w:r>
-      <w:commentRangeEnd w:id="11"/>
+      <w:commentRangeEnd w:id="13"/>
       <w:r>
         <w:rPr>
           <w:rStyle w:val="af4"/>
-        </w:rPr>
-        <w:commentReference w:id="11"/>
+          <w:strike/>
+          <w:sz w:val="24"/>
+          <w:szCs w:val="24"/>
+          <w:highlight w:val="yellow"/>
+        </w:rPr>
+        <w:commentReference w:id="13"/>
       </w:r>
       <w:r>
         <w:rPr>
@@ -601,7 +545,7 @@
       <w:pPr>
         <w:pStyle w:val="3"/>
       </w:pPr>
-      <w:bookmarkStart w:id="12" w:name="X3abe3f44b0d9c56b6fc1bc678caa48158d37738"/>
+      <w:bookmarkStart w:id="14" w:name="X3abe3f44b0d9c56b6fc1bc678caa48158d37738"/>
       <w:bookmarkEnd w:id="4"/>
       <w:r>
         <w:t xml:space="preserve">3. </w:t>
@@ -612,21 +556,21 @@
         </w:rPr>
         <w:t>月面环境数字孪生建模与</w:t>
       </w:r>
-      <w:commentRangeStart w:id="13"/>
+      <w:commentRangeStart w:id="15"/>
       <w:r>
         <w:rPr>
           <w:rFonts w:hint="eastAsia"/>
         </w:rPr>
         <w:t>仿真</w:t>
       </w:r>
-      <w:commentRangeEnd w:id="13"/>
+      <w:commentRangeEnd w:id="15"/>
       <w:r>
         <w:rPr>
           <w:rStyle w:val="af4"/>
-          <w:rFonts w:eastAsiaTheme="minorEastAsia" w:cstheme="minorBidi"/>
-          <w:color w:val="auto"/>
-        </w:rPr>
-        <w:commentReference w:id="13"/>
+          <w:sz w:val="28"/>
+          <w:szCs w:val="28"/>
+        </w:rPr>
+        <w:commentReference w:id="15"/>
       </w:r>
     </w:p>
     <w:p>
@@ -728,7 +672,7 @@
         </w:rPr>
         <w:t>月壤环境数字孪生</w:t>
       </w:r>
-      <w:commentRangeStart w:id="14"/>
+      <w:commentRangeStart w:id="16"/>
       <w:r>
         <w:rPr>
           <w:rFonts w:hint="eastAsia"/>
@@ -736,12 +680,15 @@
         </w:rPr>
         <w:t>建模</w:t>
       </w:r>
-      <w:commentRangeEnd w:id="14"/>
+      <w:commentRangeEnd w:id="16"/>
       <w:r>
         <w:rPr>
           <w:rStyle w:val="af4"/>
-        </w:rPr>
-        <w:commentReference w:id="14"/>
+          <w:color w:val="0070C0"/>
+          <w:sz w:val="24"/>
+          <w:szCs w:val="24"/>
+        </w:rPr>
+        <w:commentReference w:id="16"/>
       </w:r>
     </w:p>
     <w:p>
@@ -871,7 +818,7 @@
         </w:rPr>
         <w:t>月面环境数字孪生仿</w:t>
       </w:r>
-      <w:commentRangeStart w:id="15"/>
+      <w:commentRangeStart w:id="17"/>
       <w:r>
         <w:rPr>
           <w:rFonts w:hint="eastAsia"/>
@@ -880,12 +827,15 @@
         </w:rPr>
         <w:t>真平台</w:t>
       </w:r>
-      <w:commentRangeEnd w:id="15"/>
+      <w:commentRangeEnd w:id="17"/>
       <w:r>
         <w:rPr>
           <w:rStyle w:val="af4"/>
-        </w:rPr>
-        <w:commentReference w:id="15"/>
+          <w:sz w:val="24"/>
+          <w:szCs w:val="24"/>
+          <w:highlight w:val="yellow"/>
+        </w:rPr>
+        <w:commentReference w:id="17"/>
       </w:r>
       <w:r>
         <w:rPr>
@@ -944,8 +894,8 @@
       <w:pPr>
         <w:pStyle w:val="3"/>
       </w:pPr>
-      <w:bookmarkStart w:id="16" w:name="Xf59320170d2682e2b1859bbca91b3376d7a3992"/>
-      <w:bookmarkEnd w:id="12"/>
+      <w:bookmarkStart w:id="18" w:name="Xf59320170d2682e2b1859bbca91b3376d7a3992"/>
+      <w:bookmarkEnd w:id="14"/>
       <w:r>
         <w:t xml:space="preserve">4. </w:t>
       </w:r>
@@ -953,37 +903,23 @@
         <w:rPr>
           <w:rFonts w:hint="eastAsia"/>
         </w:rPr>
-        <w:t>月面</w:t>
-      </w:r>
-      <w:proofErr w:type="gramStart"/>
-      <w:r>
-        <w:rPr>
-          <w:rFonts w:hint="eastAsia"/>
-        </w:rPr>
-        <w:t>巡视器</w:t>
-      </w:r>
-      <w:proofErr w:type="gramEnd"/>
-      <w:r>
-        <w:rPr>
-          <w:rFonts w:hint="eastAsia"/>
-        </w:rPr>
-        <w:t>动力学数字孪生</w:t>
-      </w:r>
-      <w:commentRangeStart w:id="17"/>
+        <w:t>月面巡视器动力学数字孪生</w:t>
+      </w:r>
+      <w:commentRangeStart w:id="19"/>
       <w:r>
         <w:rPr>
           <w:rFonts w:hint="eastAsia"/>
         </w:rPr>
         <w:t>建模</w:t>
       </w:r>
-      <w:commentRangeEnd w:id="17"/>
+      <w:commentRangeEnd w:id="19"/>
       <w:r>
         <w:rPr>
           <w:rStyle w:val="af4"/>
-          <w:rFonts w:eastAsiaTheme="minorEastAsia" w:cstheme="minorBidi"/>
-          <w:color w:val="auto"/>
-        </w:rPr>
-        <w:commentReference w:id="17"/>
+          <w:sz w:val="28"/>
+          <w:szCs w:val="28"/>
+        </w:rPr>
+        <w:commentReference w:id="19"/>
       </w:r>
     </w:p>
     <w:p>
@@ -993,19 +929,11 @@
       <w:r>
         <w:t xml:space="preserve">4.1 </w:t>
       </w:r>
-      <w:proofErr w:type="gramStart"/>
-      <w:r>
-        <w:rPr>
-          <w:rFonts w:hint="eastAsia"/>
-        </w:rPr>
-        <w:t>巡视器</w:t>
-      </w:r>
-      <w:proofErr w:type="gramEnd"/>
-      <w:r>
-        <w:rPr>
-          <w:rFonts w:hint="eastAsia"/>
-        </w:rPr>
-        <w:t>动力学建模基础</w:t>
+      <w:r>
+        <w:rPr>
+          <w:rFonts w:hint="eastAsia"/>
+        </w:rPr>
+        <w:t>巡视器动力学建模基础</w:t>
       </w:r>
       <w:r>
         <w:br/>
@@ -1035,48 +963,39 @@
         </w:rPr>
         <w:t xml:space="preserve">4.2.1 </w:t>
       </w:r>
-      <w:proofErr w:type="gramStart"/>
       <w:r>
         <w:rPr>
           <w:rFonts w:hint="eastAsia"/>
           <w:color w:val="C00000"/>
         </w:rPr>
-        <w:t>巡视器</w:t>
-      </w:r>
-      <w:proofErr w:type="gramEnd"/>
-      <w:r>
-        <w:rPr>
-          <w:rFonts w:hint="eastAsia"/>
+        <w:t>巡视器本体建模</w:t>
+      </w:r>
+      <w:r>
+        <w:rPr>
           <w:color w:val="C00000"/>
         </w:rPr>
-        <w:t>本体建模</w:t>
-      </w:r>
-      <w:r>
-        <w:rPr>
+        <w:br/>
+        <w:t xml:space="preserve">4.2.2 </w:t>
+      </w:r>
+      <w:r>
+        <w:rPr>
+          <w:rFonts w:hint="eastAsia"/>
           <w:color w:val="C00000"/>
         </w:rPr>
-        <w:br/>
-        <w:t xml:space="preserve">4.2.2 </w:t>
+        <w:t>车轮</w:t>
       </w:r>
       <w:r>
         <w:rPr>
           <w:rFonts w:hint="eastAsia"/>
           <w:color w:val="C00000"/>
         </w:rPr>
-        <w:t>车轮</w:t>
+        <w:t>-</w:t>
       </w:r>
       <w:r>
         <w:rPr>
           <w:rFonts w:hint="eastAsia"/>
           <w:color w:val="C00000"/>
         </w:rPr>
-        <w:t>-</w:t>
-      </w:r>
-      <w:r>
-        <w:rPr>
-          <w:rFonts w:hint="eastAsia"/>
-          <w:color w:val="C00000"/>
-        </w:rPr>
         <w:t>月壤相互作用模型</w:t>
       </w:r>
       <w:r>
@@ -1134,8 +1053,8 @@
       <w:pPr>
         <w:pStyle w:val="3"/>
       </w:pPr>
-      <w:bookmarkStart w:id="18" w:name="Xbae84e63a106f096669c6068f3c7e00719f806c"/>
-      <w:bookmarkEnd w:id="16"/>
+      <w:bookmarkStart w:id="20" w:name="Xbae84e63a106f096669c6068f3c7e00719f806c"/>
+      <w:bookmarkEnd w:id="18"/>
       <w:r>
         <w:t xml:space="preserve">5. </w:t>
       </w:r>
@@ -1143,37 +1062,23 @@
         <w:rPr>
           <w:rFonts w:hint="eastAsia"/>
         </w:rPr>
-        <w:t>基于数字孪生的</w:t>
-      </w:r>
-      <w:proofErr w:type="gramStart"/>
-      <w:r>
-        <w:rPr>
-          <w:rFonts w:hint="eastAsia"/>
-        </w:rPr>
-        <w:t>巡视器</w:t>
-      </w:r>
-      <w:proofErr w:type="gramEnd"/>
-      <w:r>
-        <w:rPr>
-          <w:rFonts w:hint="eastAsia"/>
-        </w:rPr>
-        <w:t>路径规</w:t>
-      </w:r>
-      <w:commentRangeStart w:id="19"/>
+        <w:t>基于数字孪生的巡视器路径规</w:t>
+      </w:r>
+      <w:commentRangeStart w:id="21"/>
       <w:r>
         <w:rPr>
           <w:rFonts w:hint="eastAsia"/>
         </w:rPr>
         <w:t>划</w:t>
       </w:r>
-      <w:commentRangeEnd w:id="19"/>
+      <w:commentRangeEnd w:id="21"/>
       <w:r>
         <w:rPr>
           <w:rStyle w:val="af4"/>
-          <w:rFonts w:eastAsiaTheme="minorEastAsia" w:cstheme="minorBidi"/>
-          <w:color w:val="auto"/>
-        </w:rPr>
-        <w:commentReference w:id="19"/>
+          <w:sz w:val="28"/>
+          <w:szCs w:val="28"/>
+        </w:rPr>
+        <w:commentReference w:id="21"/>
       </w:r>
     </w:p>
     <w:p>
@@ -1334,8 +1239,8 @@
       <w:pPr>
         <w:pStyle w:val="3"/>
       </w:pPr>
-      <w:bookmarkStart w:id="20" w:name="X94ffcadf1475918f06e09b462f2f5862bb59f21"/>
-      <w:bookmarkEnd w:id="18"/>
+      <w:bookmarkStart w:id="22" w:name="X94ffcadf1475918f06e09b462f2f5862bb59f21"/>
+      <w:bookmarkEnd w:id="20"/>
       <w:r>
         <w:t xml:space="preserve">6. </w:t>
       </w:r>
@@ -1345,21 +1250,21 @@
         </w:rPr>
         <w:t>基于数字孪生的月面岩石识别与</w:t>
       </w:r>
-      <w:commentRangeStart w:id="21"/>
+      <w:commentRangeStart w:id="23"/>
       <w:r>
         <w:rPr>
           <w:rFonts w:hint="eastAsia"/>
         </w:rPr>
         <w:t>避障</w:t>
       </w:r>
-      <w:commentRangeEnd w:id="21"/>
+      <w:commentRangeEnd w:id="23"/>
       <w:r>
         <w:rPr>
           <w:rStyle w:val="af4"/>
-          <w:rFonts w:eastAsiaTheme="minorEastAsia" w:cstheme="minorBidi"/>
-          <w:color w:val="auto"/>
-        </w:rPr>
-        <w:commentReference w:id="21"/>
+          <w:sz w:val="28"/>
+          <w:szCs w:val="28"/>
+        </w:rPr>
+        <w:commentReference w:id="23"/>
       </w:r>
     </w:p>
     <w:p>
@@ -1490,8 +1395,8 @@
           <w:strike/>
         </w:rPr>
       </w:pPr>
-      <w:bookmarkStart w:id="22" w:name="X5118ea6e1f683e9d9d9e7a750f632e864eee1c5"/>
-      <w:bookmarkEnd w:id="20"/>
+      <w:bookmarkStart w:id="24" w:name="X5118ea6e1f683e9d9d9e7a750f632e864eee1c5"/>
+      <w:bookmarkEnd w:id="22"/>
       <w:r>
         <w:rPr>
           <w:strike/>
@@ -1503,180 +1408,165 @@
           <w:rFonts w:hint="eastAsia"/>
           <w:strike/>
         </w:rPr>
-        <w:t>月面</w:t>
-      </w:r>
-      <w:proofErr w:type="gramStart"/>
+        <w:t>月面巡视器数字孪生系统集成与</w:t>
+      </w:r>
+      <w:commentRangeStart w:id="25"/>
       <w:r>
         <w:rPr>
           <w:rFonts w:hint="eastAsia"/>
           <w:strike/>
         </w:rPr>
-        <w:t>巡视器数字</w:t>
-      </w:r>
-      <w:proofErr w:type="gramEnd"/>
-      <w:r>
-        <w:rPr>
-          <w:rFonts w:hint="eastAsia"/>
+        <w:t>试验</w:t>
+      </w:r>
+      <w:commentRangeEnd w:id="25"/>
+      <w:r>
+        <w:rPr>
+          <w:rStyle w:val="af4"/>
           <w:strike/>
-        </w:rPr>
-        <w:t>孪生系统集成与</w:t>
-      </w:r>
-      <w:commentRangeStart w:id="23"/>
-      <w:r>
-        <w:rPr>
-          <w:rFonts w:hint="eastAsia"/>
+          <w:sz w:val="28"/>
+          <w:szCs w:val="28"/>
+        </w:rPr>
+        <w:commentReference w:id="25"/>
+      </w:r>
+    </w:p>
+    <w:p>
+      <w:pPr>
+        <w:pStyle w:val="FirstParagraph"/>
+        <w:rPr>
           <w:strike/>
         </w:rPr>
-        <w:t>试验</w:t>
-      </w:r>
-      <w:commentRangeEnd w:id="23"/>
-      <w:r>
-        <w:rPr>
-          <w:rStyle w:val="af4"/>
-          <w:rFonts w:eastAsiaTheme="minorEastAsia" w:cstheme="minorBidi"/>
-          <w:color w:val="auto"/>
-        </w:rPr>
-        <w:commentReference w:id="23"/>
+      </w:pPr>
+      <w:r>
+        <w:rPr>
+          <w:strike/>
+        </w:rPr>
+        <w:t xml:space="preserve">7.1 </w:t>
+      </w:r>
+      <w:r>
+        <w:rPr>
+          <w:rFonts w:hint="eastAsia"/>
+          <w:strike/>
+        </w:rPr>
+        <w:t>系统集成方案</w:t>
+      </w:r>
+      <w:r>
+        <w:rPr>
+          <w:strike/>
+        </w:rPr>
+        <w:br/>
+        <w:t xml:space="preserve">7.2 </w:t>
+      </w:r>
+      <w:r>
+        <w:rPr>
+          <w:rFonts w:hint="eastAsia"/>
+          <w:strike/>
+        </w:rPr>
+        <w:t>地面集成试验</w:t>
+      </w:r>
+      <w:r>
+        <w:rPr>
+          <w:strike/>
+        </w:rPr>
+        <w:br/>
+        <w:t xml:space="preserve">7.2.1 </w:t>
+      </w:r>
+      <w:r>
+        <w:rPr>
+          <w:rFonts w:hint="eastAsia"/>
+          <w:strike/>
+        </w:rPr>
+        <w:t>硬件</w:t>
+      </w:r>
+      <w:r>
+        <w:rPr>
+          <w:rFonts w:hint="eastAsia"/>
+          <w:strike/>
+        </w:rPr>
+        <w:t>-in-the-loop</w:t>
+      </w:r>
+      <w:r>
+        <w:rPr>
+          <w:rFonts w:hint="eastAsia"/>
+          <w:strike/>
+        </w:rPr>
+        <w:t>仿真试验</w:t>
+      </w:r>
+      <w:r>
+        <w:rPr>
+          <w:strike/>
+        </w:rPr>
+        <w:br/>
+        <w:t xml:space="preserve">7.2.2 </w:t>
+      </w:r>
+      <w:r>
+        <w:rPr>
+          <w:rFonts w:hint="eastAsia"/>
+          <w:strike/>
+        </w:rPr>
+        <w:t>半物理仿真试验</w:t>
+      </w:r>
+      <w:r>
+        <w:rPr>
+          <w:strike/>
+        </w:rPr>
+        <w:br/>
+        <w:t xml:space="preserve">7.3 </w:t>
+      </w:r>
+      <w:r>
+        <w:rPr>
+          <w:rFonts w:hint="eastAsia"/>
+          <w:strike/>
+        </w:rPr>
+        <w:t>试验结果与分析</w:t>
+      </w:r>
+      <w:r>
+        <w:rPr>
+          <w:strike/>
+        </w:rPr>
+        <w:br/>
+        <w:t xml:space="preserve">7.4 </w:t>
+      </w:r>
+      <w:r>
+        <w:rPr>
+          <w:rFonts w:hint="eastAsia"/>
+          <w:strike/>
+        </w:rPr>
+        <w:t>系统性能评估</w:t>
+      </w:r>
+      <w:r>
+        <w:rPr>
+          <w:strike/>
+        </w:rPr>
+        <w:br/>
+        <w:t xml:space="preserve">7.5 </w:t>
+      </w:r>
+      <w:r>
+        <w:rPr>
+          <w:rFonts w:hint="eastAsia"/>
+          <w:strike/>
+        </w:rPr>
+        <w:t>本章小结</w:t>
+      </w:r>
+    </w:p>
+    <w:p>
+      <w:pPr>
+        <w:pStyle w:val="3"/>
+      </w:pPr>
+      <w:bookmarkStart w:id="26" w:name="Xbf7001ec7e75c870d7fd75c57bc37c768d968f0"/>
+      <w:bookmarkEnd w:id="24"/>
+      <w:r>
+        <w:t xml:space="preserve">8. </w:t>
+      </w:r>
+      <w:r>
+        <w:rPr>
+          <w:rFonts w:hint="eastAsia"/>
+        </w:rPr>
+        <w:t>结论与展望</w:t>
       </w:r>
     </w:p>
     <w:p>
       <w:pPr>
         <w:pStyle w:val="FirstParagraph"/>
-        <w:rPr>
-          <w:strike/>
-        </w:rPr>
-      </w:pPr>
-      <w:r>
-        <w:rPr>
-          <w:strike/>
-        </w:rPr>
-        <w:t xml:space="preserve">7.1 </w:t>
-      </w:r>
-      <w:r>
-        <w:rPr>
-          <w:rFonts w:hint="eastAsia"/>
-          <w:strike/>
-        </w:rPr>
-        <w:t>系统集成方案</w:t>
-      </w:r>
-      <w:r>
-        <w:rPr>
-          <w:strike/>
-        </w:rPr>
-        <w:br/>
-        <w:t xml:space="preserve">7.2 </w:t>
-      </w:r>
-      <w:r>
-        <w:rPr>
-          <w:rFonts w:hint="eastAsia"/>
-          <w:strike/>
-        </w:rPr>
-        <w:t>地面集成试验</w:t>
-      </w:r>
-      <w:r>
-        <w:rPr>
-          <w:strike/>
-        </w:rPr>
-        <w:br/>
-        <w:t xml:space="preserve">7.2.1 </w:t>
-      </w:r>
-      <w:r>
-        <w:rPr>
-          <w:rFonts w:hint="eastAsia"/>
-          <w:strike/>
-        </w:rPr>
-        <w:t>硬件</w:t>
-      </w:r>
-      <w:r>
-        <w:rPr>
-          <w:rFonts w:hint="eastAsia"/>
-          <w:strike/>
-        </w:rPr>
-        <w:t>-in-the-loop</w:t>
-      </w:r>
-      <w:r>
-        <w:rPr>
-          <w:rFonts w:hint="eastAsia"/>
-          <w:strike/>
-        </w:rPr>
-        <w:t>仿真试验</w:t>
-      </w:r>
-      <w:r>
-        <w:rPr>
-          <w:strike/>
-        </w:rPr>
-        <w:br/>
-        <w:t xml:space="preserve">7.2.2 </w:t>
-      </w:r>
-      <w:r>
-        <w:rPr>
-          <w:rFonts w:hint="eastAsia"/>
-          <w:strike/>
-        </w:rPr>
-        <w:t>半物理仿真试验</w:t>
-      </w:r>
-      <w:r>
-        <w:rPr>
-          <w:strike/>
-        </w:rPr>
-        <w:br/>
-        <w:t xml:space="preserve">7.3 </w:t>
-      </w:r>
-      <w:r>
-        <w:rPr>
-          <w:rFonts w:hint="eastAsia"/>
-          <w:strike/>
-        </w:rPr>
-        <w:t>试验结果与分析</w:t>
-      </w:r>
-      <w:r>
-        <w:rPr>
-          <w:strike/>
-        </w:rPr>
-        <w:br/>
-        <w:t xml:space="preserve">7.4 </w:t>
-      </w:r>
-      <w:r>
-        <w:rPr>
-          <w:rFonts w:hint="eastAsia"/>
-          <w:strike/>
-        </w:rPr>
-        <w:t>系统性能评估</w:t>
-      </w:r>
-      <w:r>
-        <w:rPr>
-          <w:strike/>
-        </w:rPr>
-        <w:br/>
-        <w:t xml:space="preserve">7.5 </w:t>
-      </w:r>
-      <w:r>
-        <w:rPr>
-          <w:rFonts w:hint="eastAsia"/>
-          <w:strike/>
-        </w:rPr>
-        <w:t>本章小结</w:t>
-      </w:r>
-    </w:p>
-    <w:p>
-      <w:pPr>
-        <w:pStyle w:val="3"/>
-      </w:pPr>
-      <w:bookmarkStart w:id="24" w:name="Xbf7001ec7e75c870d7fd75c57bc37c768d968f0"/>
-      <w:bookmarkEnd w:id="22"/>
-      <w:r>
-        <w:t xml:space="preserve">8. </w:t>
-      </w:r>
-      <w:r>
-        <w:rPr>
-          <w:rFonts w:hint="eastAsia"/>
-        </w:rPr>
-        <w:t>结论与展望</w:t>
-      </w:r>
-    </w:p>
-    <w:p>
-      <w:pPr>
-        <w:pStyle w:val="FirstParagraph"/>
       </w:pPr>
       <w:r>
         <w:t xml:space="preserve">8.1 </w:t>
@@ -1708,7 +1598,7 @@
         <w:t>研究不足与未来展望</w:t>
       </w:r>
       <w:bookmarkEnd w:id="0"/>
-      <w:bookmarkEnd w:id="24"/>
+      <w:bookmarkEnd w:id="26"/>
     </w:p>
     <w:sectPr>
       <w:footnotePr>
@@ -1831,13 +1721,7 @@
         <w:rPr>
           <w:rFonts w:hint="eastAsia"/>
         </w:rPr>
-        <w:t>这样也可以，但是在本小节，</w:t>
-      </w:r>
-      <w:r>
-        <w:rPr>
-          <w:rFonts w:hint="eastAsia"/>
-        </w:rPr>
-        <w:t>与</w:t>
+        <w:t>这样也可以，但是在本小节，与</w:t>
       </w:r>
       <w:r>
         <w:rPr>
@@ -1903,9 +1787,6 @@
     <w:p>
       <w:pPr>
         <w:pStyle w:val="af5"/>
-        <w:rPr>
-          <w:rFonts w:hint="eastAsia"/>
-        </w:rPr>
       </w:pPr>
     </w:p>
   </w:comment>
@@ -1913,9 +1794,6 @@
     <w:p>
       <w:pPr>
         <w:pStyle w:val="af5"/>
-        <w:rPr>
-          <w:rFonts w:hint="eastAsia"/>
-        </w:rPr>
       </w:pPr>
       <w:r>
         <w:rPr>
@@ -1961,9 +1839,6 @@
     <w:p>
       <w:pPr>
         <w:pStyle w:val="af5"/>
-        <w:rPr>
-          <w:rFonts w:hint="eastAsia"/>
-        </w:rPr>
       </w:pPr>
       <w:r>
         <w:rPr>
@@ -2256,9 +2131,6 @@
     <w:p>
       <w:pPr>
         <w:pStyle w:val="af5"/>
-        <w:rPr>
-          <w:rFonts w:hint="eastAsia"/>
-        </w:rPr>
       </w:pPr>
       <w:r>
         <w:rPr>
@@ -2288,16 +2160,8 @@
         <w:rPr>
           <w:rFonts w:hint="eastAsia"/>
         </w:rPr>
-        <w:t>增强的是</w:t>
-      </w:r>
-      <w:proofErr w:type="gramStart"/>
-      <w:r>
-        <w:rPr>
-          <w:rFonts w:hint="eastAsia"/>
-        </w:rPr>
-        <w:t>“</w:t>
-      </w:r>
-      <w:proofErr w:type="gramEnd"/>
+        <w:t>增强的是“</w:t>
+      </w:r>
       <w:r>
         <w:rPr>
           <w:b/>
@@ -2322,19 +2186,11 @@
       <w:r>
         <w:t> </w:t>
       </w:r>
-      <w:proofErr w:type="gramStart"/>
-      <w:r>
-        <w:rPr>
-          <w:rFonts w:hint="eastAsia"/>
-        </w:rPr>
-        <w:t>”</w:t>
-      </w:r>
-      <w:proofErr w:type="gramEnd"/>
-      <w:r>
-        <w:rPr>
-          <w:rFonts w:hint="eastAsia"/>
-        </w:rPr>
-        <w:t>中的感知服务</w:t>
+      <w:r>
+        <w:rPr>
+          <w:rFonts w:hint="eastAsia"/>
+        </w:rPr>
+        <w:t>”中的感知服务</w:t>
       </w:r>
     </w:p>
   </w:comment>
@@ -2353,21 +2209,7 @@
         <w:rPr>
           <w:rFonts w:hint="eastAsia"/>
         </w:rPr>
-        <w:t>除了</w:t>
-      </w:r>
-      <w:proofErr w:type="gramStart"/>
-      <w:r>
-        <w:rPr>
-          <w:rFonts w:hint="eastAsia"/>
-        </w:rPr>
-        <w:t>巡视器</w:t>
-      </w:r>
-      <w:proofErr w:type="gramEnd"/>
-      <w:r>
-        <w:rPr>
-          <w:rFonts w:hint="eastAsia"/>
-        </w:rPr>
-        <w:t>本身，应该还有月面环境实体</w:t>
+        <w:t>除了巡视器本身，应该还有月面环境实体</w:t>
       </w:r>
       <w:r>
         <w:rPr>
@@ -2422,7 +2264,7 @@
       </w:pPr>
     </w:p>
   </w:comment>
-  <w:comment w:id="10" w:author="Author" w:date="2025-12-11T13:04:00Z" w:initials="A">
+  <w:comment w:id="11" w:author="Author" w:date="2025-12-11T13:04:00Z" w:initials="A">
     <w:p>
       <w:pPr>
         <w:pStyle w:val="af5"/>
@@ -2471,13 +2313,10 @@
       </w:r>
     </w:p>
   </w:comment>
-  <w:comment w:id="11" w:author="Author" w:date="2025-12-12T08:53:00Z" w:initials="A">
+  <w:comment w:id="13" w:author="Author" w:date="2025-12-12T08:53:00Z" w:initials="A">
     <w:p>
       <w:pPr>
         <w:pStyle w:val="af5"/>
-        <w:rPr>
-          <w:rFonts w:hint="eastAsia"/>
-        </w:rPr>
       </w:pPr>
       <w:r>
         <w:rPr>
@@ -2496,25 +2335,11 @@
         <w:rPr>
           <w:rFonts w:hint="eastAsia"/>
         </w:rPr>
-        <w:t>博士论文中，不应该</w:t>
-      </w:r>
-      <w:proofErr w:type="gramStart"/>
-      <w:r>
-        <w:rPr>
-          <w:rFonts w:hint="eastAsia"/>
-        </w:rPr>
-        <w:t>写关键</w:t>
-      </w:r>
-      <w:proofErr w:type="gramEnd"/>
-      <w:r>
-        <w:rPr>
-          <w:rFonts w:hint="eastAsia"/>
-        </w:rPr>
-        <w:t>技术，这是工程上的写法，整篇论文都是“关键技术”。删掉该小节。</w:t>
+        <w:t>博士论文中，不应该写关键技术，这是工程上的写法，整篇论文都是“关键技术”。删掉该小节。</w:t>
       </w:r>
     </w:p>
   </w:comment>
-  <w:comment w:id="13" w:author="Author" w:date="2025-12-11T13:07:00Z" w:initials="A">
+  <w:comment w:id="15" w:author="Author" w:date="2025-12-11T13:07:00Z" w:initials="A">
     <w:p>
       <w:pPr>
         <w:pStyle w:val="af5"/>
@@ -2549,7 +2374,7 @@
       </w:r>
     </w:p>
   </w:comment>
-  <w:comment w:id="14" w:author="Author" w:date="2025-12-12T09:07:00Z" w:initials="A">
+  <w:comment w:id="16" w:author="Author" w:date="2025-12-12T09:07:00Z" w:initials="A">
     <w:p>
       <w:pPr>
         <w:pStyle w:val="af5"/>
@@ -2575,13 +2400,10 @@
       </w:r>
     </w:p>
   </w:comment>
-  <w:comment w:id="15" w:author="Author" w:date="2025-12-12T08:56:00Z" w:initials="A">
+  <w:comment w:id="17" w:author="Author" w:date="2025-12-12T08:56:00Z" w:initials="A">
     <w:p>
       <w:pPr>
         <w:pStyle w:val="af5"/>
-        <w:rPr>
-          <w:rFonts w:hint="eastAsia"/>
-        </w:rPr>
       </w:pPr>
       <w:r>
         <w:rPr>
@@ -2600,19 +2422,7 @@
         <w:rPr>
           <w:rFonts w:hint="eastAsia"/>
         </w:rPr>
-        <w:t>博士论文中，不应该写</w:t>
-      </w:r>
-      <w:r>
-        <w:rPr>
-          <w:rFonts w:hint="eastAsia"/>
-        </w:rPr>
-        <w:t>平台</w:t>
-      </w:r>
-      <w:r>
-        <w:rPr>
-          <w:rFonts w:hint="eastAsia"/>
-        </w:rPr>
-        <w:t>，这是工程上的写法。</w:t>
+        <w:t>博士论文中，不应该写平台，这是工程上的写法。</w:t>
       </w:r>
     </w:p>
     <w:p>
@@ -2621,7 +2431,7 @@
       </w:pPr>
     </w:p>
   </w:comment>
-  <w:comment w:id="17" w:author="Author" w:date="2025-12-11T13:07:00Z" w:initials="A">
+  <w:comment w:id="19" w:author="Author" w:date="2025-12-11T13:07:00Z" w:initials="A">
     <w:p>
       <w:pPr>
         <w:pStyle w:val="af5"/>
@@ -2637,23 +2447,56 @@
           <w:rFonts w:hint="eastAsia"/>
           <w:highlight w:val="yellow"/>
         </w:rPr>
-        <w:t>物理实体：</w:t>
-      </w:r>
-      <w:proofErr w:type="gramStart"/>
+        <w:t>物理实体：巡视器本体建模</w:t>
+      </w:r>
+    </w:p>
+    <w:p>
+      <w:pPr>
+        <w:pStyle w:val="af5"/>
+        <w:rPr>
+          <w:color w:val="EE0000"/>
+        </w:rPr>
+      </w:pPr>
+      <w:r>
+        <w:rPr>
+          <w:rFonts w:hint="eastAsia"/>
+          <w:color w:val="EE0000"/>
+        </w:rPr>
+        <w:t>只是从五维模型去理解，不用回复</w:t>
+      </w:r>
+    </w:p>
+  </w:comment>
+  <w:comment w:id="21" w:author="Author" w:date="2025-12-11T13:08:00Z" w:initials="A">
+    <w:p>
+      <w:pPr>
+        <w:pStyle w:val="af5"/>
+      </w:pPr>
+      <w:r>
+        <w:rPr>
+          <w:rStyle w:val="af4"/>
+        </w:rPr>
+        <w:annotationRef/>
+      </w:r>
       <w:r>
         <w:rPr>
           <w:rFonts w:hint="eastAsia"/>
           <w:highlight w:val="yellow"/>
         </w:rPr>
-        <w:t>巡视器</w:t>
-      </w:r>
-      <w:proofErr w:type="gramEnd"/>
+        <w:t>服务：</w:t>
+      </w:r>
       <w:r>
         <w:rPr>
           <w:rFonts w:hint="eastAsia"/>
           <w:highlight w:val="yellow"/>
         </w:rPr>
-        <w:t>本体建模</w:t>
+        <w:t>路径</w:t>
+      </w:r>
+      <w:r>
+        <w:rPr>
+          <w:rFonts w:hint="eastAsia"/>
+          <w:highlight w:val="yellow"/>
+        </w:rPr>
+        <w:t>规划算法</w:t>
       </w:r>
     </w:p>
     <w:p>
@@ -2671,8 +2514,174 @@
         <w:t>只是从五维模型去理解，不用回复</w:t>
       </w:r>
     </w:p>
+    <w:p>
+      <w:pPr>
+        <w:pStyle w:val="af5"/>
+      </w:pPr>
+    </w:p>
+    <w:p>
+      <w:pPr>
+        <w:pStyle w:val="af5"/>
+      </w:pPr>
+    </w:p>
+    <w:p>
+      <w:pPr>
+        <w:pStyle w:val="af5"/>
+      </w:pPr>
+      <w:r>
+        <w:rPr>
+          <w:rFonts w:hint="eastAsia"/>
+        </w:rPr>
+        <w:t>5</w:t>
+      </w:r>
+      <w:r>
+        <w:rPr>
+          <w:rFonts w:hint="eastAsia"/>
+        </w:rPr>
+        <w:t>、</w:t>
+      </w:r>
+      <w:r>
+        <w:rPr>
+          <w:rFonts w:hint="eastAsia"/>
+        </w:rPr>
+        <w:t>6</w:t>
+      </w:r>
+      <w:r>
+        <w:rPr>
+          <w:rFonts w:hint="eastAsia"/>
+        </w:rPr>
+        <w:t>章的顺序问题：</w:t>
+      </w:r>
+    </w:p>
+    <w:p>
+      <w:pPr>
+        <w:pStyle w:val="af5"/>
+      </w:pPr>
+      <w:r>
+        <w:rPr>
+          <w:rFonts w:hint="eastAsia"/>
+        </w:rPr>
+        <w:t>1</w:t>
+      </w:r>
+      <w:r>
+        <w:rPr>
+          <w:rFonts w:hint="eastAsia"/>
+        </w:rPr>
+        <w:t>、原来理解，是先岩石识别，再做路径规划，岩石识别，是路劲规划的输入。所以，按现在目录，</w:t>
+      </w:r>
+      <w:r>
+        <w:rPr>
+          <w:rFonts w:hint="eastAsia"/>
+        </w:rPr>
+        <w:t>5</w:t>
+      </w:r>
+      <w:r>
+        <w:rPr>
+          <w:rFonts w:hint="eastAsia"/>
+        </w:rPr>
+        <w:t>、</w:t>
+      </w:r>
+      <w:r>
+        <w:rPr>
+          <w:rFonts w:hint="eastAsia"/>
+        </w:rPr>
+        <w:t>6</w:t>
+      </w:r>
+      <w:r>
+        <w:rPr>
+          <w:rFonts w:hint="eastAsia"/>
+        </w:rPr>
+        <w:t>章应该换一下顺序。</w:t>
+      </w:r>
+    </w:p>
+    <w:p>
+      <w:pPr>
+        <w:pStyle w:val="af5"/>
+      </w:pPr>
+    </w:p>
+    <w:p>
+      <w:pPr>
+        <w:pStyle w:val="af5"/>
+      </w:pPr>
+      <w:r>
+        <w:rPr>
+          <w:rFonts w:hint="eastAsia"/>
+        </w:rPr>
+        <w:t>2</w:t>
+      </w:r>
+      <w:r>
+        <w:rPr>
+          <w:rFonts w:hint="eastAsia"/>
+        </w:rPr>
+        <w:t>、如果按现在</w:t>
+      </w:r>
+      <w:r>
+        <w:rPr>
+          <w:rFonts w:hint="eastAsia"/>
+        </w:rPr>
+        <w:t>5</w:t>
+      </w:r>
+      <w:r>
+        <w:rPr>
+          <w:rFonts w:hint="eastAsia"/>
+        </w:rPr>
+        <w:t>、</w:t>
+      </w:r>
+      <w:r>
+        <w:rPr>
+          <w:rFonts w:hint="eastAsia"/>
+        </w:rPr>
+        <w:t>6</w:t>
+      </w:r>
+      <w:r>
+        <w:rPr>
+          <w:rFonts w:hint="eastAsia"/>
+        </w:rPr>
+        <w:t>顺序不变，那就理解为：先做路径规划，然后边走边识别岩石障碍物，边修正路径，这样更突出“实时感知”。</w:t>
+      </w:r>
+    </w:p>
+    <w:p>
+      <w:pPr>
+        <w:pStyle w:val="af5"/>
+      </w:pPr>
+    </w:p>
+    <w:p>
+      <w:pPr>
+        <w:pStyle w:val="af5"/>
+      </w:pPr>
+      <w:r>
+        <w:rPr>
+          <w:rFonts w:hint="eastAsia"/>
+        </w:rPr>
+        <w:t>不知道以上，</w:t>
+      </w:r>
+      <w:r>
+        <w:rPr>
+          <w:rFonts w:hint="eastAsia"/>
+        </w:rPr>
+        <w:t>1</w:t>
+      </w:r>
+      <w:r>
+        <w:rPr>
+          <w:rFonts w:hint="eastAsia"/>
+        </w:rPr>
+        <w:t>、</w:t>
+      </w:r>
+      <w:r>
+        <w:rPr>
+          <w:rFonts w:hint="eastAsia"/>
+        </w:rPr>
+        <w:t>2</w:t>
+      </w:r>
+      <w:r>
+        <w:rPr>
+          <w:rFonts w:hint="eastAsia"/>
+        </w:rPr>
+        <w:t>哪一种理解比较符合老师的思路？</w:t>
+      </w:r>
+    </w:p>
   </w:comment>
-  <w:comment w:id="19" w:author="Author" w:date="2025-12-11T13:08:00Z" w:initials="A">
+  <w:comment w:id="23" w:author="Author" w:date="2025-12-11T13:17:00Z" w:initials="A">
     <w:p>
       <w:pPr>
         <w:pStyle w:val="af5"/>
@@ -2688,21 +2697,7 @@
           <w:rFonts w:hint="eastAsia"/>
           <w:highlight w:val="yellow"/>
         </w:rPr>
-        <w:t>服务：</w:t>
-      </w:r>
-      <w:r>
-        <w:rPr>
-          <w:rFonts w:hint="eastAsia"/>
-          <w:highlight w:val="yellow"/>
-        </w:rPr>
-        <w:t>路径</w:t>
-      </w:r>
-      <w:r>
-        <w:rPr>
-          <w:rFonts w:hint="eastAsia"/>
-          <w:highlight w:val="yellow"/>
-        </w:rPr>
-        <w:t>规划算法</w:t>
+        <w:t>服务：环境感知算法</w:t>
       </w:r>
     </w:p>
     <w:p>
@@ -2725,223 +2720,8 @@
         <w:pStyle w:val="af5"/>
       </w:pPr>
     </w:p>
-    <w:p>
-      <w:pPr>
-        <w:pStyle w:val="af5"/>
-      </w:pPr>
-    </w:p>
-    <w:p>
-      <w:pPr>
-        <w:pStyle w:val="af5"/>
-      </w:pPr>
-      <w:r>
-        <w:rPr>
-          <w:rFonts w:hint="eastAsia"/>
-        </w:rPr>
-        <w:t>5</w:t>
-      </w:r>
-      <w:r>
-        <w:rPr>
-          <w:rFonts w:hint="eastAsia"/>
-        </w:rPr>
-        <w:t>、</w:t>
-      </w:r>
-      <w:r>
-        <w:rPr>
-          <w:rFonts w:hint="eastAsia"/>
-        </w:rPr>
-        <w:t>6</w:t>
-      </w:r>
-      <w:r>
-        <w:rPr>
-          <w:rFonts w:hint="eastAsia"/>
-        </w:rPr>
-        <w:t>章的顺序问题：</w:t>
-      </w:r>
-    </w:p>
-    <w:p>
-      <w:pPr>
-        <w:pStyle w:val="af5"/>
-      </w:pPr>
-      <w:r>
-        <w:rPr>
-          <w:rFonts w:hint="eastAsia"/>
-        </w:rPr>
-        <w:t>1</w:t>
-      </w:r>
-      <w:r>
-        <w:rPr>
-          <w:rFonts w:hint="eastAsia"/>
-        </w:rPr>
-        <w:t>、原来理解，是先岩石识别，再做路径规划，岩石识别，是路</w:t>
-      </w:r>
-      <w:proofErr w:type="gramStart"/>
-      <w:r>
-        <w:rPr>
-          <w:rFonts w:hint="eastAsia"/>
-        </w:rPr>
-        <w:t>劲规划</w:t>
-      </w:r>
-      <w:proofErr w:type="gramEnd"/>
-      <w:r>
-        <w:rPr>
-          <w:rFonts w:hint="eastAsia"/>
-        </w:rPr>
-        <w:t>的输入。所以，按现在目录，</w:t>
-      </w:r>
-      <w:r>
-        <w:rPr>
-          <w:rFonts w:hint="eastAsia"/>
-        </w:rPr>
-        <w:t>5</w:t>
-      </w:r>
-      <w:r>
-        <w:rPr>
-          <w:rFonts w:hint="eastAsia"/>
-        </w:rPr>
-        <w:t>、</w:t>
-      </w:r>
-      <w:r>
-        <w:rPr>
-          <w:rFonts w:hint="eastAsia"/>
-        </w:rPr>
-        <w:t>6</w:t>
-      </w:r>
-      <w:r>
-        <w:rPr>
-          <w:rFonts w:hint="eastAsia"/>
-        </w:rPr>
-        <w:t>章应该换一下顺序。</w:t>
-      </w:r>
-    </w:p>
-    <w:p>
-      <w:pPr>
-        <w:pStyle w:val="af5"/>
-      </w:pPr>
-    </w:p>
-    <w:p>
-      <w:pPr>
-        <w:pStyle w:val="af5"/>
-      </w:pPr>
-      <w:r>
-        <w:rPr>
-          <w:rFonts w:hint="eastAsia"/>
-        </w:rPr>
-        <w:t>2</w:t>
-      </w:r>
-      <w:r>
-        <w:rPr>
-          <w:rFonts w:hint="eastAsia"/>
-        </w:rPr>
-        <w:t>、如果按现在</w:t>
-      </w:r>
-      <w:r>
-        <w:rPr>
-          <w:rFonts w:hint="eastAsia"/>
-        </w:rPr>
-        <w:t>5</w:t>
-      </w:r>
-      <w:r>
-        <w:rPr>
-          <w:rFonts w:hint="eastAsia"/>
-        </w:rPr>
-        <w:t>、</w:t>
-      </w:r>
-      <w:r>
-        <w:rPr>
-          <w:rFonts w:hint="eastAsia"/>
-        </w:rPr>
-        <w:t>6</w:t>
-      </w:r>
-      <w:r>
-        <w:rPr>
-          <w:rFonts w:hint="eastAsia"/>
-        </w:rPr>
-        <w:t>顺序不变，那就理解为：先做路径规划，然后边走边识别岩石障碍物，边修正路径，这样更突出“实时感知”。</w:t>
-      </w:r>
-    </w:p>
-    <w:p>
-      <w:pPr>
-        <w:pStyle w:val="af5"/>
-      </w:pPr>
-    </w:p>
-    <w:p>
-      <w:pPr>
-        <w:pStyle w:val="af5"/>
-      </w:pPr>
-      <w:r>
-        <w:rPr>
-          <w:rFonts w:hint="eastAsia"/>
-        </w:rPr>
-        <w:t>不知道以上，</w:t>
-      </w:r>
-      <w:r>
-        <w:rPr>
-          <w:rFonts w:hint="eastAsia"/>
-        </w:rPr>
-        <w:t>1</w:t>
-      </w:r>
-      <w:r>
-        <w:rPr>
-          <w:rFonts w:hint="eastAsia"/>
-        </w:rPr>
-        <w:t>、</w:t>
-      </w:r>
-      <w:r>
-        <w:rPr>
-          <w:rFonts w:hint="eastAsia"/>
-        </w:rPr>
-        <w:t>2</w:t>
-      </w:r>
-      <w:r>
-        <w:rPr>
-          <w:rFonts w:hint="eastAsia"/>
-        </w:rPr>
-        <w:t>哪一种理解比较符合老师的思路？</w:t>
-      </w:r>
-    </w:p>
   </w:comment>
-  <w:comment w:id="21" w:author="Author" w:date="2025-12-11T13:17:00Z" w:initials="A">
-    <w:p>
-      <w:pPr>
-        <w:pStyle w:val="af5"/>
-      </w:pPr>
-      <w:r>
-        <w:rPr>
-          <w:rStyle w:val="af4"/>
-        </w:rPr>
-        <w:annotationRef/>
-      </w:r>
-      <w:r>
-        <w:rPr>
-          <w:rFonts w:hint="eastAsia"/>
-          <w:highlight w:val="yellow"/>
-        </w:rPr>
-        <w:t>服务：环境感知算法</w:t>
-      </w:r>
-    </w:p>
-    <w:p>
-      <w:pPr>
-        <w:pStyle w:val="af5"/>
-        <w:rPr>
-          <w:color w:val="EE0000"/>
-        </w:rPr>
-      </w:pPr>
-      <w:r>
-        <w:rPr>
-          <w:rFonts w:hint="eastAsia"/>
-          <w:color w:val="EE0000"/>
-        </w:rPr>
-        <w:t>只是从五维模型去理解，不用回复</w:t>
-      </w:r>
-    </w:p>
-    <w:p>
-      <w:pPr>
-        <w:pStyle w:val="af5"/>
-      </w:pPr>
-    </w:p>
-  </w:comment>
-  <w:comment w:id="23" w:author="Author" w:date="2025-12-12T09:11:00Z" w:initials="A">
+  <w:comment w:id="25" w:author="Author" w:date="2025-12-12T09:11:00Z" w:initials="A">
     <w:p>
       <w:pPr>
         <w:pStyle w:val="af5"/>
@@ -3666,6 +3446,7 @@
   <w:style w:type="character" w:default="1" w:styleId="a1">
     <w:name w:val="Default Paragraph Font"/>
     <w:uiPriority w:val="1"/>
+    <w:semiHidden/>
     <w:unhideWhenUsed/>
   </w:style>
   <w:style w:type="table" w:default="1" w:styleId="a2">
@@ -4799,4 +4580,16 @@
     </a:ext>
   </a:extLst>
 </a:theme>
+</file>
+
+<file path=customXml/item1.xml><?xml version="1.0" encoding="utf-8"?>
+<b:Sources xmlns:b="http://schemas.openxmlformats.org/officeDocument/2006/bibliography" xmlns="http://schemas.openxmlformats.org/officeDocument/2006/bibliography" SelectedStyle="\APASixthEditionOfficeOnline.xsl" StyleName="APA" Version="6"/>
+</file>
+
+<file path=customXml/itemProps1.xml><?xml version="1.0" encoding="utf-8"?>
+<ds:datastoreItem xmlns:ds="http://schemas.openxmlformats.org/officeDocument/2006/customXml" ds:itemID="{37E2C1C8-AC35-42F2-8B2D-03A8B85715F9}">
+  <ds:schemaRefs>
+    <ds:schemaRef ds:uri="http://schemas.openxmlformats.org/officeDocument/2006/bibliography"/>
+  </ds:schemaRefs>
+</ds:datastoreItem>
 </file>
</xml_diff>